<commit_message>
Strip Google Docs export cruft from Ghana templates
Ghana templates were exported from Google Docs and carried a
customXml/ folder with gDocsCustomXmlDataStorage metadata plus a
Normal style that wasn't marked as default. Cloudmersive's
LibreOffice backend still 500s on these even after font cleanup, so
this drops the customXml part entirely (folder + relationships +
Content_Types entries) and sets w:default="1" on Normal.
</commit_message>
<xml_diff>
--- a/backend/templates/Plus_Template_Polished.docx
+++ b/backend/templates/Plus_Template_Polished.docx
@@ -2069,7 +2069,7 @@
       </w:pPr>
     </w:pPrDefault>
   </w:docDefaults>
-  <w:style w:type="paragraph" w:styleId="Normal">
+  <w:style w:type="paragraph" w:styleId="Normal" w:default="1">
     <w:name w:val="Normal"/>
     <w:qFormat/>
     <w:pPr>
@@ -2544,19 +2544,4 @@
     </a:fmtScheme>
   </a:themeElements>
 </a:theme>
-</file>
-
-<file path=customXml/item1.xml><?xml version="1.0" encoding="utf-8"?>
-<go:gDocsCustomXmlDataStorage xmlns:go="http://customooxmlschemas.google.com/" xmlns:r="http://schemas.openxmlformats.org/officeDocument/2006/relationships" uri="GoogleDocsCustomDataVersion2">
-  <go:docsCustomData roundtripDataSignature="AMtx7mjJULRIlHXB5fadTEMAFbKwqNwvCg==">CgMxLjA4AHIhMVJEWTdQZnhuS1JtVUF1TWFzQ3FDQXprZkQ5dmtZVWdE</go:docsCustomData>
-</go:gDocsCustomXmlDataStorage>
-</file>
-
-<file path=customXml/itemProps1.xml><?xml version="1.0" encoding="utf-8"?>
-<ds:datastoreItem xmlns:ds="http://schemas.openxmlformats.org/officeDocument/2006/customXml" ds:itemID="{11111111-1234-1234-1234-123412341234}">
-  <ds:schemaRefs>
-    <ds:schemaRef ds:uri="http://schemas.openxmlformats.org/officeDocument/2006/relationships"/>
-    <ds:schemaRef ds:uri="http://customooxmlschemas.google.com/"/>
-  </ds:schemaRefs>
-</ds:datastoreItem>
 </file>
</xml_diff>

<commit_message>
Swap Nigeria footer for Ghana company details
footer2.xml and footer3.xml in the Nigeria-derived templates still
carried "JUDY Artificial Intelligence Solutions (Reg No. 3841223), 19
Ademola Street, Ikoyi, Lagos". Replaced with Ghana equivalents from
the original Ghana template: JUDY Innovative Technologies Limited
(Reg No. CS019370121), 19 Aluguntugui Street East Legon,
hello@judy.legal, +233 24 648 4255.
</commit_message>
<xml_diff>
--- a/backend/templates/Plus_Template_Polished.docx
+++ b/backend/templates/Plus_Template_Polished.docx
@@ -2450,75 +2450,7 @@
                             <w:rPr>
                               <w:color w:val="8A2B8A"/>
                             </w:rPr>
-                            <w:t>JUDY</w:t>
-                          </w:r>
-                          <w:r>
-                            <w:rPr>
-                              <w:color w:val="8A2B8A"/>
-                              <w:spacing w:val="-6"/>
-                            </w:rPr>
-                            <w:t xml:space="preserve"> </w:t>
-                          </w:r>
-                          <w:r>
-                            <w:rPr>
-                              <w:color w:val="8A2B8A"/>
-                              <w:spacing w:val="-6"/>
-                            </w:rPr>
-                            <w:t>Artificial Intelligence</w:t>
-                          </w:r>
-                          <w:r>
-                            <w:rPr>
-                              <w:color w:val="8A2B8A"/>
-                              <w:spacing w:val="-5"/>
-                            </w:rPr>
-                            <w:t xml:space="preserve"> </w:t>
-                          </w:r>
-                          <w:r>
-                            <w:rPr>
-                              <w:color w:val="8A2B8A"/>
-                              <w:spacing w:val="-5"/>
-                            </w:rPr>
-                            <w:t>Solutions</w:t>
-                          </w:r>
-                          <w:r>
-                            <w:rPr>
-                              <w:color w:val="8A2B8A"/>
-                              <w:spacing w:val="-6"/>
-                            </w:rPr>
-                            <w:t xml:space="preserve"> </w:t>
-                          </w:r>
-                          <w:r>
-                            <w:rPr>
-                              <w:color w:val="8A2B8A"/>
-                            </w:rPr>
-                            <w:t>(Reg</w:t>
-                          </w:r>
-                          <w:r>
-                            <w:rPr>
-                              <w:color w:val="8A2B8A"/>
-                              <w:spacing w:val="-6"/>
-                            </w:rPr>
-                            <w:t xml:space="preserve"> </w:t>
-                          </w:r>
-                          <w:r>
-                            <w:rPr>
-                              <w:color w:val="8A2B8A"/>
-                            </w:rPr>
-                            <w:t>No.</w:t>
-                          </w:r>
-                          <w:r>
-                            <w:rPr>
-                              <w:color w:val="8A2B8A"/>
-                              <w:spacing w:val="-5"/>
-                            </w:rPr>
-                            <w:t xml:space="preserve"> 3841223</w:t>
-                          </w:r>
-                          <w:r>
-                            <w:rPr>
-                              <w:color w:val="8A2B8A"/>
-                              <w:spacing w:val="-2"/>
-                            </w:rPr>
-                            <w:t>)</w:t>
+                            <w:t>JUDY Innovative Technologies Limited (Reg No. CS019370121)</w:t>
                           </w:r>
                         </w:p>
                         <w:p>
@@ -2532,163 +2464,7 @@
                             <w:rPr>
                               <w:color w:val="8A2B8A"/>
                             </w:rPr>
-                            <w:t>19</w:t>
-                          </w:r>
-                          <w:r>
-                            <w:rPr>
-                              <w:color w:val="8A2B8A"/>
-                              <w:spacing w:val="-3"/>
-                            </w:rPr>
-                            <w:t xml:space="preserve"> </w:t>
-                          </w:r>
-                          <w:r>
-                            <w:rPr>
-                              <w:color w:val="8A2B8A"/>
-                            </w:rPr>
-                            <w:t>A</w:t>
-                          </w:r>
-                          <w:r>
-                            <w:rPr>
-                              <w:color w:val="8A2B8A"/>
-                            </w:rPr>
-                            <w:t>demola</w:t>
-                          </w:r>
-                          <w:r>
-                            <w:rPr>
-                              <w:color w:val="8A2B8A"/>
-                              <w:spacing w:val="-3"/>
-                            </w:rPr>
-                            <w:t xml:space="preserve"> </w:t>
-                          </w:r>
-                          <w:r>
-                            <w:rPr>
-                              <w:color w:val="8A2B8A"/>
-                            </w:rPr>
-                            <w:t>Street,</w:t>
-                          </w:r>
-                          <w:r>
-                            <w:rPr>
-                              <w:color w:val="8A2B8A"/>
-                              <w:spacing w:val="-3"/>
-                            </w:rPr>
-                            <w:t xml:space="preserve"> </w:t>
-                          </w:r>
-                          <w:r>
-                            <w:rPr>
-                              <w:color w:val="8A2B8A"/>
-                              <w:spacing w:val="-3"/>
-                            </w:rPr>
-                            <w:t>Ikoyi, Lagos</w:t>
-                          </w:r>
-                          <w:r>
-                            <w:rPr>
-                              <w:color w:val="8A2B8A"/>
-                              <w:spacing w:val="34"/>
-                            </w:rPr>
-                            <w:t xml:space="preserve"> </w:t>
-                          </w:r>
-                          <w:r>
-                            <w:rPr>
-                              <w:color w:val="8A2B8A"/>
-                            </w:rPr>
-                            <w:t>|</w:t>
-                          </w:r>
-                          <w:r>
-                            <w:rPr>
-                              <w:color w:val="8A2B8A"/>
-                              <w:spacing w:val="35"/>
-                            </w:rPr>
-                            <w:t xml:space="preserve"> </w:t>
-                          </w:r>
-                          <w:hyperlink r:id="rId1">
-                            <w:r>
-                              <w:rPr>
-                                <w:rStyle w:val="Style7"/>
-                                <w:color w:val="8A2B8A"/>
-                              </w:rPr>
-                              <w:t>hello@judy.legal</w:t>
-                            </w:r>
-                          </w:hyperlink>
-                          <w:r>
-                            <w:rPr>
-                              <w:color w:val="8A2B8A"/>
-                              <w:spacing w:val="35"/>
-                            </w:rPr>
-                            <w:t xml:space="preserve"> </w:t>
-                          </w:r>
-                          <w:r>
-                            <w:rPr>
-                              <w:color w:val="8A2B8A"/>
-                            </w:rPr>
-                            <w:t>|</w:t>
-                          </w:r>
-                          <w:r>
-                            <w:rPr>
-                              <w:color w:val="8A2B8A"/>
-                              <w:spacing w:val="34"/>
-                            </w:rPr>
-                            <w:t xml:space="preserve"> </w:t>
-                          </w:r>
-                          <w:r>
-                            <w:rPr>
-                              <w:color w:val="8A2B8A"/>
-                            </w:rPr>
-                            <w:t>+23</w:t>
-                          </w:r>
-                          <w:r>
-                            <w:rPr>
-                              <w:color w:val="8A2B8A"/>
-                            </w:rPr>
-                            <w:t>4</w:t>
-                          </w:r>
-                          <w:r>
-                            <w:rPr>
-                              <w:color w:val="8A2B8A"/>
-                              <w:spacing w:val="-3"/>
-                            </w:rPr>
-                            <w:t xml:space="preserve"> </w:t>
-                          </w:r>
-                          <w:r>
-                            <w:rPr>
-                              <w:color w:val="8A2B8A"/>
-                              <w:spacing w:val="-3"/>
-                            </w:rPr>
-                            <w:t>818</w:t>
-                          </w:r>
-                          <w:r>
-                            <w:rPr>
-                              <w:color w:val="8A2B8A"/>
-                              <w:spacing w:val="-3"/>
-                            </w:rPr>
-                            <w:t xml:space="preserve"> </w:t>
-                          </w:r>
-                          <w:r>
-                            <w:rPr>
-                              <w:color w:val="8A2B8A"/>
-                              <w:spacing w:val="-3"/>
-                            </w:rPr>
-                            <w:t>749</w:t>
-                          </w:r>
-                          <w:r>
-                            <w:rPr>
-                              <w:color w:val="8A2B8A"/>
-                              <w:spacing w:val="-3"/>
-                            </w:rPr>
-                            <w:t xml:space="preserve"> </w:t>
-                          </w:r>
-                          <w:r>
-                            <w:rPr>
-                              <w:color w:val="8A2B8A"/>
-                              <w:spacing w:val="-4"/>
-                            </w:rPr>
-                            <w:t>4</w:t>
-                          </w:r>
-                          <w:r>
-                            <w:rPr>
-                              <w:color w:val="8A2B8A"/>
-                              <w:spacing w:val="-4"/>
-                            </w:rPr>
-                            <w:t>741</w:t>
+                            <w:t xml:space="preserve">19 Aluguntugui Street, East Legon  |  hello@judy.legal  |  +233 24 648 4255</w:t>
                           </w:r>
                         </w:p>
                       </w:txbxContent>
@@ -2721,75 +2497,7 @@
                       <w:rPr>
                         <w:color w:val="8A2B8A"/>
                       </w:rPr>
-                      <w:t>JUDY</w:t>
-                    </w:r>
-                    <w:r>
-                      <w:rPr>
-                        <w:color w:val="8A2B8A"/>
-                        <w:spacing w:val="-6"/>
-                      </w:rPr>
-                      <w:t xml:space="preserve"> </w:t>
-                    </w:r>
-                    <w:r>
-                      <w:rPr>
-                        <w:color w:val="8A2B8A"/>
-                        <w:spacing w:val="-6"/>
-                      </w:rPr>
-                      <w:t>Artificial Intelligence</w:t>
-                    </w:r>
-                    <w:r>
-                      <w:rPr>
-                        <w:color w:val="8A2B8A"/>
-                        <w:spacing w:val="-5"/>
-                      </w:rPr>
-                      <w:t xml:space="preserve"> </w:t>
-                    </w:r>
-                    <w:r>
-                      <w:rPr>
-                        <w:color w:val="8A2B8A"/>
-                        <w:spacing w:val="-5"/>
-                      </w:rPr>
-                      <w:t>Solutions</w:t>
-                    </w:r>
-                    <w:r>
-                      <w:rPr>
-                        <w:color w:val="8A2B8A"/>
-                        <w:spacing w:val="-6"/>
-                      </w:rPr>
-                      <w:t xml:space="preserve"> </w:t>
-                    </w:r>
-                    <w:r>
-                      <w:rPr>
-                        <w:color w:val="8A2B8A"/>
-                      </w:rPr>
-                      <w:t>(Reg</w:t>
-                    </w:r>
-                    <w:r>
-                      <w:rPr>
-                        <w:color w:val="8A2B8A"/>
-                        <w:spacing w:val="-6"/>
-                      </w:rPr>
-                      <w:t xml:space="preserve"> </w:t>
-                    </w:r>
-                    <w:r>
-                      <w:rPr>
-                        <w:color w:val="8A2B8A"/>
-                      </w:rPr>
-                      <w:t>No.</w:t>
-                    </w:r>
-                    <w:r>
-                      <w:rPr>
-                        <w:color w:val="8A2B8A"/>
-                        <w:spacing w:val="-5"/>
-                      </w:rPr>
-                      <w:t xml:space="preserve"> 3841223</w:t>
-                    </w:r>
-                    <w:r>
-                      <w:rPr>
-                        <w:color w:val="8A2B8A"/>
-                        <w:spacing w:val="-2"/>
-                      </w:rPr>
-                      <w:t>)</w:t>
+                      <w:t>JUDY Innovative Technologies Limited (Reg No. CS019370121)</w:t>
                     </w:r>
                   </w:p>
                   <w:p>
@@ -2803,163 +2511,7 @@
                       <w:rPr>
                         <w:color w:val="8A2B8A"/>
                       </w:rPr>
-                      <w:t>19</w:t>
-                    </w:r>
-                    <w:r>
-                      <w:rPr>
-                        <w:color w:val="8A2B8A"/>
-                        <w:spacing w:val="-3"/>
-                      </w:rPr>
-                      <w:t xml:space="preserve"> </w:t>
-                    </w:r>
-                    <w:r>
-                      <w:rPr>
-                        <w:color w:val="8A2B8A"/>
-                      </w:rPr>
-                      <w:t>A</w:t>
-                    </w:r>
-                    <w:r>
-                      <w:rPr>
-                        <w:color w:val="8A2B8A"/>
-                      </w:rPr>
-                      <w:t>demola</w:t>
-                    </w:r>
-                    <w:r>
-                      <w:rPr>
-                        <w:color w:val="8A2B8A"/>
-                        <w:spacing w:val="-3"/>
-                      </w:rPr>
-                      <w:t xml:space="preserve"> </w:t>
-                    </w:r>
-                    <w:r>
-                      <w:rPr>
-                        <w:color w:val="8A2B8A"/>
-                      </w:rPr>
-                      <w:t>Street,</w:t>
-                    </w:r>
-                    <w:r>
-                      <w:rPr>
-                        <w:color w:val="8A2B8A"/>
-                        <w:spacing w:val="-3"/>
-                      </w:rPr>
-                      <w:t xml:space="preserve"> </w:t>
-                    </w:r>
-                    <w:r>
-                      <w:rPr>
-                        <w:color w:val="8A2B8A"/>
-                        <w:spacing w:val="-3"/>
-                      </w:rPr>
-                      <w:t>Ikoyi, Lagos</w:t>
-                    </w:r>
-                    <w:r>
-                      <w:rPr>
-                        <w:color w:val="8A2B8A"/>
-                        <w:spacing w:val="34"/>
-                      </w:rPr>
-                      <w:t xml:space="preserve"> </w:t>
-                    </w:r>
-                    <w:r>
-                      <w:rPr>
-                        <w:color w:val="8A2B8A"/>
-                      </w:rPr>
-                      <w:t>|</w:t>
-                    </w:r>
-                    <w:r>
-                      <w:rPr>
-                        <w:color w:val="8A2B8A"/>
-                        <w:spacing w:val="35"/>
-                      </w:rPr>
-                      <w:t xml:space="preserve"> </w:t>
-                    </w:r>
-                    <w:hyperlink r:id="rId2">
-                      <w:r>
-                        <w:rPr>
-                          <w:rStyle w:val="Style7"/>
-                          <w:color w:val="8A2B8A"/>
-                        </w:rPr>
-                        <w:t>hello@judy.legal</w:t>
-                      </w:r>
-                    </w:hyperlink>
-                    <w:r>
-                      <w:rPr>
-                        <w:color w:val="8A2B8A"/>
-                        <w:spacing w:val="35"/>
-                      </w:rPr>
-                      <w:t xml:space="preserve"> </w:t>
-                    </w:r>
-                    <w:r>
-                      <w:rPr>
-                        <w:color w:val="8A2B8A"/>
-                      </w:rPr>
-                      <w:t>|</w:t>
-                    </w:r>
-                    <w:r>
-                      <w:rPr>
-                        <w:color w:val="8A2B8A"/>
-                        <w:spacing w:val="34"/>
-                      </w:rPr>
-                      <w:t xml:space="preserve"> </w:t>
-                    </w:r>
-                    <w:r>
-                      <w:rPr>
-                        <w:color w:val="8A2B8A"/>
-                      </w:rPr>
-                      <w:t>+23</w:t>
-                    </w:r>
-                    <w:r>
-                      <w:rPr>
-                        <w:color w:val="8A2B8A"/>
-                      </w:rPr>
-                      <w:t>4</w:t>
-                    </w:r>
-                    <w:r>
-                      <w:rPr>
-                        <w:color w:val="8A2B8A"/>
-                        <w:spacing w:val="-3"/>
-                      </w:rPr>
-                      <w:t xml:space="preserve"> </w:t>
-                    </w:r>
-                    <w:r>
-                      <w:rPr>
-                        <w:color w:val="8A2B8A"/>
-                        <w:spacing w:val="-3"/>
-                      </w:rPr>
-                      <w:t>818</w:t>
-                    </w:r>
-                    <w:r>
-                      <w:rPr>
-                        <w:color w:val="8A2B8A"/>
-                        <w:spacing w:val="-3"/>
-                      </w:rPr>
-                      <w:t xml:space="preserve"> </w:t>
-                    </w:r>
-                    <w:r>
-                      <w:rPr>
-                        <w:color w:val="8A2B8A"/>
-                        <w:spacing w:val="-3"/>
-                      </w:rPr>
-                      <w:t>749</w:t>
-                    </w:r>
-                    <w:r>
-                      <w:rPr>
-                        <w:color w:val="8A2B8A"/>
-                        <w:spacing w:val="-3"/>
-                      </w:rPr>
-                      <w:t xml:space="preserve"> </w:t>
-                    </w:r>
-                    <w:r>
-                      <w:rPr>
-                        <w:color w:val="8A2B8A"/>
-                        <w:spacing w:val="-4"/>
-                      </w:rPr>
-                      <w:t>4</w:t>
-                    </w:r>
-                    <w:r>
-                      <w:rPr>
-                        <w:color w:val="8A2B8A"/>
-                        <w:spacing w:val="-4"/>
-                      </w:rPr>
-                      <w:t>741</w:t>
+                      <w:t xml:space="preserve">19 Aluguntugui Street, East Legon  |  hello@judy.legal  |  +233 24 648 4255</w:t>
                     </w:r>
                   </w:p>
                 </w:txbxContent>
@@ -3040,75 +2592,7 @@
                             <w:rPr>
                               <w:color w:val="8A2B8A"/>
                             </w:rPr>
-                            <w:t>JUDY</w:t>
-                          </w:r>
-                          <w:r>
-                            <w:rPr>
-                              <w:color w:val="8A2B8A"/>
-                              <w:spacing w:val="-6"/>
-                            </w:rPr>
-                            <w:t xml:space="preserve"> </w:t>
-                          </w:r>
-                          <w:r>
-                            <w:rPr>
-                              <w:color w:val="8A2B8A"/>
-                              <w:spacing w:val="-6"/>
-                            </w:rPr>
-                            <w:t>Artificial Intelligence</w:t>
-                          </w:r>
-                          <w:r>
-                            <w:rPr>
-                              <w:color w:val="8A2B8A"/>
-                              <w:spacing w:val="-5"/>
-                            </w:rPr>
-                            <w:t xml:space="preserve"> </w:t>
-                          </w:r>
-                          <w:r>
-                            <w:rPr>
-                              <w:color w:val="8A2B8A"/>
-                              <w:spacing w:val="-5"/>
-                            </w:rPr>
-                            <w:t>Solutions</w:t>
-                          </w:r>
-                          <w:r>
-                            <w:rPr>
-                              <w:color w:val="8A2B8A"/>
-                              <w:spacing w:val="-6"/>
-                            </w:rPr>
-                            <w:t xml:space="preserve"> </w:t>
-                          </w:r>
-                          <w:r>
-                            <w:rPr>
-                              <w:color w:val="8A2B8A"/>
-                            </w:rPr>
-                            <w:t>(Reg</w:t>
-                          </w:r>
-                          <w:r>
-                            <w:rPr>
-                              <w:color w:val="8A2B8A"/>
-                              <w:spacing w:val="-6"/>
-                            </w:rPr>
-                            <w:t xml:space="preserve"> </w:t>
-                          </w:r>
-                          <w:r>
-                            <w:rPr>
-                              <w:color w:val="8A2B8A"/>
-                            </w:rPr>
-                            <w:t>No.</w:t>
-                          </w:r>
-                          <w:r>
-                            <w:rPr>
-                              <w:color w:val="8A2B8A"/>
-                              <w:spacing w:val="-5"/>
-                            </w:rPr>
-                            <w:t xml:space="preserve"> 3841223</w:t>
-                          </w:r>
-                          <w:r>
-                            <w:rPr>
-                              <w:color w:val="8A2B8A"/>
-                              <w:spacing w:val="-2"/>
-                            </w:rPr>
-                            <w:t>)</w:t>
+                            <w:t>JUDY Innovative Technologies Limited (Reg No. CS019370121)</w:t>
                           </w:r>
                         </w:p>
                         <w:p>
@@ -3122,163 +2606,7 @@
                             <w:rPr>
                               <w:color w:val="8A2B8A"/>
                             </w:rPr>
-                            <w:t>19</w:t>
-                          </w:r>
-                          <w:r>
-                            <w:rPr>
-                              <w:color w:val="8A2B8A"/>
-                              <w:spacing w:val="-3"/>
-                            </w:rPr>
-                            <w:t xml:space="preserve"> </w:t>
-                          </w:r>
-                          <w:r>
-                            <w:rPr>
-                              <w:color w:val="8A2B8A"/>
-                            </w:rPr>
-                            <w:t>A</w:t>
-                          </w:r>
-                          <w:r>
-                            <w:rPr>
-                              <w:color w:val="8A2B8A"/>
-                            </w:rPr>
-                            <w:t>demola</w:t>
-                          </w:r>
-                          <w:r>
-                            <w:rPr>
-                              <w:color w:val="8A2B8A"/>
-                              <w:spacing w:val="-3"/>
-                            </w:rPr>
-                            <w:t xml:space="preserve"> </w:t>
-                          </w:r>
-                          <w:r>
-                            <w:rPr>
-                              <w:color w:val="8A2B8A"/>
-                            </w:rPr>
-                            <w:t>Street,</w:t>
-                          </w:r>
-                          <w:r>
-                            <w:rPr>
-                              <w:color w:val="8A2B8A"/>
-                              <w:spacing w:val="-3"/>
-                            </w:rPr>
-                            <w:t xml:space="preserve"> </w:t>
-                          </w:r>
-                          <w:r>
-                            <w:rPr>
-                              <w:color w:val="8A2B8A"/>
-                              <w:spacing w:val="-3"/>
-                            </w:rPr>
-                            <w:t>Ikoyi, Lagos</w:t>
-                          </w:r>
-                          <w:r>
-                            <w:rPr>
-                              <w:color w:val="8A2B8A"/>
-                              <w:spacing w:val="34"/>
-                            </w:rPr>
-                            <w:t xml:space="preserve"> </w:t>
-                          </w:r>
-                          <w:r>
-                            <w:rPr>
-                              <w:color w:val="8A2B8A"/>
-                            </w:rPr>
-                            <w:t>|</w:t>
-                          </w:r>
-                          <w:r>
-                            <w:rPr>
-                              <w:color w:val="8A2B8A"/>
-                              <w:spacing w:val="35"/>
-                            </w:rPr>
-                            <w:t xml:space="preserve"> </w:t>
-                          </w:r>
-                          <w:hyperlink r:id="rId1">
-                            <w:r>
-                              <w:rPr>
-                                <w:rStyle w:val="Style7"/>
-                                <w:color w:val="8A2B8A"/>
-                              </w:rPr>
-                              <w:t>hello@judy.legal</w:t>
-                            </w:r>
-                          </w:hyperlink>
-                          <w:r>
-                            <w:rPr>
-                              <w:color w:val="8A2B8A"/>
-                              <w:spacing w:val="35"/>
-                            </w:rPr>
-                            <w:t xml:space="preserve"> </w:t>
-                          </w:r>
-                          <w:r>
-                            <w:rPr>
-                              <w:color w:val="8A2B8A"/>
-                            </w:rPr>
-                            <w:t>|</w:t>
-                          </w:r>
-                          <w:r>
-                            <w:rPr>
-                              <w:color w:val="8A2B8A"/>
-                              <w:spacing w:val="34"/>
-                            </w:rPr>
-                            <w:t xml:space="preserve"> </w:t>
-                          </w:r>
-                          <w:r>
-                            <w:rPr>
-                              <w:color w:val="8A2B8A"/>
-                            </w:rPr>
-                            <w:t>+23</w:t>
-                          </w:r>
-                          <w:r>
-                            <w:rPr>
-                              <w:color w:val="8A2B8A"/>
-                            </w:rPr>
-                            <w:t>4</w:t>
-                          </w:r>
-                          <w:r>
-                            <w:rPr>
-                              <w:color w:val="8A2B8A"/>
-                              <w:spacing w:val="-3"/>
-                            </w:rPr>
-                            <w:t xml:space="preserve"> </w:t>
-                          </w:r>
-                          <w:r>
-                            <w:rPr>
-                              <w:color w:val="8A2B8A"/>
-                              <w:spacing w:val="-3"/>
-                            </w:rPr>
-                            <w:t>818</w:t>
-                          </w:r>
-                          <w:r>
-                            <w:rPr>
-                              <w:color w:val="8A2B8A"/>
-                              <w:spacing w:val="-3"/>
-                            </w:rPr>
-                            <w:t xml:space="preserve"> </w:t>
-                          </w:r>
-                          <w:r>
-                            <w:rPr>
-                              <w:color w:val="8A2B8A"/>
-                              <w:spacing w:val="-3"/>
-                            </w:rPr>
-                            <w:t>749</w:t>
-                          </w:r>
-                          <w:r>
-                            <w:rPr>
-                              <w:color w:val="8A2B8A"/>
-                              <w:spacing w:val="-3"/>
-                            </w:rPr>
-                            <w:t xml:space="preserve"> </w:t>
-                          </w:r>
-                          <w:r>
-                            <w:rPr>
-                              <w:color w:val="8A2B8A"/>
-                              <w:spacing w:val="-4"/>
-                            </w:rPr>
-                            <w:t>4</w:t>
-                          </w:r>
-                          <w:r>
-                            <w:rPr>
-                              <w:color w:val="8A2B8A"/>
-                              <w:spacing w:val="-4"/>
-                            </w:rPr>
-                            <w:t>741</w:t>
+                            <w:t xml:space="preserve">19 Aluguntugui Street, East Legon  |  hello@judy.legal  |  +233 24 648 4255</w:t>
                           </w:r>
                         </w:p>
                       </w:txbxContent>
@@ -3311,75 +2639,7 @@
                       <w:rPr>
                         <w:color w:val="8A2B8A"/>
                       </w:rPr>
-                      <w:t>JUDY</w:t>
-                    </w:r>
-                    <w:r>
-                      <w:rPr>
-                        <w:color w:val="8A2B8A"/>
-                        <w:spacing w:val="-6"/>
-                      </w:rPr>
-                      <w:t xml:space="preserve"> </w:t>
-                    </w:r>
-                    <w:r>
-                      <w:rPr>
-                        <w:color w:val="8A2B8A"/>
-                        <w:spacing w:val="-6"/>
-                      </w:rPr>
-                      <w:t>Artificial Intelligence</w:t>
-                    </w:r>
-                    <w:r>
-                      <w:rPr>
-                        <w:color w:val="8A2B8A"/>
-                        <w:spacing w:val="-5"/>
-                      </w:rPr>
-                      <w:t xml:space="preserve"> </w:t>
-                    </w:r>
-                    <w:r>
-                      <w:rPr>
-                        <w:color w:val="8A2B8A"/>
-                        <w:spacing w:val="-5"/>
-                      </w:rPr>
-                      <w:t>Solutions</w:t>
-                    </w:r>
-                    <w:r>
-                      <w:rPr>
-                        <w:color w:val="8A2B8A"/>
-                        <w:spacing w:val="-6"/>
-                      </w:rPr>
-                      <w:t xml:space="preserve"> </w:t>
-                    </w:r>
-                    <w:r>
-                      <w:rPr>
-                        <w:color w:val="8A2B8A"/>
-                      </w:rPr>
-                      <w:t>(Reg</w:t>
-                    </w:r>
-                    <w:r>
-                      <w:rPr>
-                        <w:color w:val="8A2B8A"/>
-                        <w:spacing w:val="-6"/>
-                      </w:rPr>
-                      <w:t xml:space="preserve"> </w:t>
-                    </w:r>
-                    <w:r>
-                      <w:rPr>
-                        <w:color w:val="8A2B8A"/>
-                      </w:rPr>
-                      <w:t>No.</w:t>
-                    </w:r>
-                    <w:r>
-                      <w:rPr>
-                        <w:color w:val="8A2B8A"/>
-                        <w:spacing w:val="-5"/>
-                      </w:rPr>
-                      <w:t xml:space="preserve"> 3841223</w:t>
-                    </w:r>
-                    <w:r>
-                      <w:rPr>
-                        <w:color w:val="8A2B8A"/>
-                        <w:spacing w:val="-2"/>
-                      </w:rPr>
-                      <w:t>)</w:t>
+                      <w:t>JUDY Innovative Technologies Limited (Reg No. CS019370121)</w:t>
                     </w:r>
                   </w:p>
                   <w:p>
@@ -3393,163 +2653,7 @@
                       <w:rPr>
                         <w:color w:val="8A2B8A"/>
                       </w:rPr>
-                      <w:t>19</w:t>
-                    </w:r>
-                    <w:r>
-                      <w:rPr>
-                        <w:color w:val="8A2B8A"/>
-                        <w:spacing w:val="-3"/>
-                      </w:rPr>
-                      <w:t xml:space="preserve"> </w:t>
-                    </w:r>
-                    <w:r>
-                      <w:rPr>
-                        <w:color w:val="8A2B8A"/>
-                      </w:rPr>
-                      <w:t>A</w:t>
-                    </w:r>
-                    <w:r>
-                      <w:rPr>
-                        <w:color w:val="8A2B8A"/>
-                      </w:rPr>
-                      <w:t>demola</w:t>
-                    </w:r>
-                    <w:r>
-                      <w:rPr>
-                        <w:color w:val="8A2B8A"/>
-                        <w:spacing w:val="-3"/>
-                      </w:rPr>
-                      <w:t xml:space="preserve"> </w:t>
-                    </w:r>
-                    <w:r>
-                      <w:rPr>
-                        <w:color w:val="8A2B8A"/>
-                      </w:rPr>
-                      <w:t>Street,</w:t>
-                    </w:r>
-                    <w:r>
-                      <w:rPr>
-                        <w:color w:val="8A2B8A"/>
-                        <w:spacing w:val="-3"/>
-                      </w:rPr>
-                      <w:t xml:space="preserve"> </w:t>
-                    </w:r>
-                    <w:r>
-                      <w:rPr>
-                        <w:color w:val="8A2B8A"/>
-                        <w:spacing w:val="-3"/>
-                      </w:rPr>
-                      <w:t>Ikoyi, Lagos</w:t>
-                    </w:r>
-                    <w:r>
-                      <w:rPr>
-                        <w:color w:val="8A2B8A"/>
-                        <w:spacing w:val="34"/>
-                      </w:rPr>
-                      <w:t xml:space="preserve"> </w:t>
-                    </w:r>
-                    <w:r>
-                      <w:rPr>
-                        <w:color w:val="8A2B8A"/>
-                      </w:rPr>
-                      <w:t>|</w:t>
-                    </w:r>
-                    <w:r>
-                      <w:rPr>
-                        <w:color w:val="8A2B8A"/>
-                        <w:spacing w:val="35"/>
-                      </w:rPr>
-                      <w:t xml:space="preserve"> </w:t>
-                    </w:r>
-                    <w:hyperlink r:id="rId2">
-                      <w:r>
-                        <w:rPr>
-                          <w:rStyle w:val="Style7"/>
-                          <w:color w:val="8A2B8A"/>
-                        </w:rPr>
-                        <w:t>hello@judy.legal</w:t>
-                      </w:r>
-                    </w:hyperlink>
-                    <w:r>
-                      <w:rPr>
-                        <w:color w:val="8A2B8A"/>
-                        <w:spacing w:val="35"/>
-                      </w:rPr>
-                      <w:t xml:space="preserve"> </w:t>
-                    </w:r>
-                    <w:r>
-                      <w:rPr>
-                        <w:color w:val="8A2B8A"/>
-                      </w:rPr>
-                      <w:t>|</w:t>
-                    </w:r>
-                    <w:r>
-                      <w:rPr>
-                        <w:color w:val="8A2B8A"/>
-                        <w:spacing w:val="34"/>
-                      </w:rPr>
-                      <w:t xml:space="preserve"> </w:t>
-                    </w:r>
-                    <w:r>
-                      <w:rPr>
-                        <w:color w:val="8A2B8A"/>
-                      </w:rPr>
-                      <w:t>+23</w:t>
-                    </w:r>
-                    <w:r>
-                      <w:rPr>
-                        <w:color w:val="8A2B8A"/>
-                      </w:rPr>
-                      <w:t>4</w:t>
-                    </w:r>
-                    <w:r>
-                      <w:rPr>
-                        <w:color w:val="8A2B8A"/>
-                        <w:spacing w:val="-3"/>
-                      </w:rPr>
-                      <w:t xml:space="preserve"> </w:t>
-                    </w:r>
-                    <w:r>
-                      <w:rPr>
-                        <w:color w:val="8A2B8A"/>
-                        <w:spacing w:val="-3"/>
-                      </w:rPr>
-                      <w:t>818</w:t>
-                    </w:r>
-                    <w:r>
-                      <w:rPr>
-                        <w:color w:val="8A2B8A"/>
-                        <w:spacing w:val="-3"/>
-                      </w:rPr>
-                      <w:t xml:space="preserve"> </w:t>
-                    </w:r>
-                    <w:r>
-                      <w:rPr>
-                        <w:color w:val="8A2B8A"/>
-                        <w:spacing w:val="-3"/>
-                      </w:rPr>
-                      <w:t>749</w:t>
-                    </w:r>
-                    <w:r>
-                      <w:rPr>
-                        <w:color w:val="8A2B8A"/>
-                        <w:spacing w:val="-3"/>
-                      </w:rPr>
-                      <w:t xml:space="preserve"> </w:t>
-                    </w:r>
-                    <w:r>
-                      <w:rPr>
-                        <w:color w:val="8A2B8A"/>
-                        <w:spacing w:val="-4"/>
-                      </w:rPr>
-                      <w:t>4</w:t>
-                    </w:r>
-                    <w:r>
-                      <w:rPr>
-                        <w:color w:val="8A2B8A"/>
-                        <w:spacing w:val="-4"/>
-                      </w:rPr>
-                      <w:t>741</w:t>
+                      <w:t xml:space="preserve">19 Aluguntugui Street, East Legon  |  hello@judy.legal  |  +233 24 648 4255</w:t>
                     </w:r>
                   </w:p>
                 </w:txbxContent>

</xml_diff>